<commit_message>
Refactor and clean up code across multiple files
- Updated Jupyter notebooks to reset execution counts and IDs for consistency.
- Removed output messages from code cells in notebooks to streamline execution.
- Modified `gtfs_utils.py` to improve code formatting and maintainability.
- Adjusted `from_txt_to_xlsx.ipynb` to change the target file for conversion.
- Added a new `requirements.txt` file for dependency management.
- Enhanced `stops_ids_names.py` for better readability and structure.
- Fixed minor formatting issues in `utils.py` for improved clarity.
- Updated binary file in `__pycache__` to reflect changes in the codebase.
</commit_message>
<xml_diff>
--- a/.work/02.14 data comprovations left.docx
+++ b/.work/02.14 data comprovations left.docx
@@ -11,13 +11,53 @@
         </w:numPr>
         <w:rPr>
           <w:rFonts w:ascii="Arial" w:hAnsi="Arial" w:cs="Arial"/>
-        </w:rPr>
-      </w:pPr>
-      <w:r>
-        <w:rPr>
-          <w:rFonts w:ascii="Arial" w:hAnsi="Arial" w:cs="Arial"/>
-        </w:rPr>
-        <w:t>A mirar per stop_times (només per trips_id que comencin per 1):</w:t>
+          <w:sz w:val="24"/>
+          <w:szCs w:val="24"/>
+        </w:rPr>
+      </w:pPr>
+      <w:r>
+        <w:rPr>
+          <w:rFonts w:ascii="Arial" w:hAnsi="Arial" w:cs="Arial"/>
+          <w:sz w:val="24"/>
+          <w:szCs w:val="24"/>
+        </w:rPr>
+        <w:t xml:space="preserve">A mirar per </w:t>
+      </w:r>
+      <w:proofErr w:type="spellStart"/>
+      <w:r>
+        <w:rPr>
+          <w:rFonts w:ascii="Arial" w:hAnsi="Arial" w:cs="Arial"/>
+          <w:sz w:val="24"/>
+          <w:szCs w:val="24"/>
+        </w:rPr>
+        <w:t>stop_times</w:t>
+      </w:r>
+      <w:proofErr w:type="spellEnd"/>
+      <w:r>
+        <w:rPr>
+          <w:rFonts w:ascii="Arial" w:hAnsi="Arial" w:cs="Arial"/>
+          <w:sz w:val="24"/>
+          <w:szCs w:val="24"/>
+        </w:rPr>
+        <w:t xml:space="preserve"> (només per </w:t>
+      </w:r>
+      <w:proofErr w:type="spellStart"/>
+      <w:r>
+        <w:rPr>
+          <w:rFonts w:ascii="Arial" w:hAnsi="Arial" w:cs="Arial"/>
+          <w:sz w:val="24"/>
+          <w:szCs w:val="24"/>
+        </w:rPr>
+        <w:t>trips_id</w:t>
+      </w:r>
+      <w:proofErr w:type="spellEnd"/>
+      <w:r>
+        <w:rPr>
+          <w:rFonts w:ascii="Arial" w:hAnsi="Arial" w:cs="Arial"/>
+          <w:sz w:val="24"/>
+          <w:szCs w:val="24"/>
+        </w:rPr>
+        <w:t xml:space="preserve"> que comencin per 1):</w:t>
       </w:r>
     </w:p>
     <w:p>
@@ -30,19 +70,56 @@
         <w:rPr>
           <w:rFonts w:ascii="Arial" w:hAnsi="Arial" w:cs="Arial"/>
           <w:color w:val="808080" w:themeColor="background1" w:themeShade="80"/>
-        </w:rPr>
-      </w:pPr>
-      <w:r>
-        <w:rPr>
-          <w:rFonts w:ascii="Arial" w:hAnsi="Arial" w:cs="Arial"/>
-          <w:color w:val="808080" w:themeColor="background1" w:themeShade="80"/>
-        </w:rPr>
-        <w:t>Veure si stop_sequence sempre incrementa d’1 en 1 pel mateix trip_id</w:t>
-      </w:r>
-      <w:r>
-        <w:rPr>
-          <w:rFonts w:ascii="Arial" w:hAnsi="Arial" w:cs="Arial"/>
-          <w:color w:val="808080" w:themeColor="background1" w:themeShade="80"/>
+          <w:sz w:val="24"/>
+          <w:szCs w:val="24"/>
+        </w:rPr>
+      </w:pPr>
+      <w:r>
+        <w:rPr>
+          <w:rFonts w:ascii="Arial" w:hAnsi="Arial" w:cs="Arial"/>
+          <w:color w:val="808080" w:themeColor="background1" w:themeShade="80"/>
+          <w:sz w:val="24"/>
+          <w:szCs w:val="24"/>
+        </w:rPr>
+        <w:t xml:space="preserve">Veure si </w:t>
+      </w:r>
+      <w:proofErr w:type="spellStart"/>
+      <w:r>
+        <w:rPr>
+          <w:rFonts w:ascii="Arial" w:hAnsi="Arial" w:cs="Arial"/>
+          <w:color w:val="808080" w:themeColor="background1" w:themeShade="80"/>
+          <w:sz w:val="24"/>
+          <w:szCs w:val="24"/>
+        </w:rPr>
+        <w:t>stop_sequence</w:t>
+      </w:r>
+      <w:proofErr w:type="spellEnd"/>
+      <w:r>
+        <w:rPr>
+          <w:rFonts w:ascii="Arial" w:hAnsi="Arial" w:cs="Arial"/>
+          <w:color w:val="808080" w:themeColor="background1" w:themeShade="80"/>
+          <w:sz w:val="24"/>
+          <w:szCs w:val="24"/>
+        </w:rPr>
+        <w:t xml:space="preserve"> sempre incrementa d’1 en 1 pel mateix </w:t>
+      </w:r>
+      <w:proofErr w:type="spellStart"/>
+      <w:r>
+        <w:rPr>
+          <w:rFonts w:ascii="Arial" w:hAnsi="Arial" w:cs="Arial"/>
+          <w:color w:val="808080" w:themeColor="background1" w:themeShade="80"/>
+          <w:sz w:val="24"/>
+          <w:szCs w:val="24"/>
+        </w:rPr>
+        <w:t>trip_id</w:t>
+      </w:r>
+      <w:proofErr w:type="spellEnd"/>
+      <w:r>
+        <w:rPr>
+          <w:rFonts w:ascii="Arial" w:hAnsi="Arial" w:cs="Arial"/>
+          <w:color w:val="808080" w:themeColor="background1" w:themeShade="80"/>
+          <w:sz w:val="24"/>
+          <w:szCs w:val="24"/>
         </w:rPr>
         <w:t xml:space="preserve"> </w:t>
       </w:r>
@@ -57,12 +134,16 @@
         <w:rPr>
           <w:rFonts w:ascii="Arial" w:hAnsi="Arial" w:cs="Arial"/>
           <w:color w:val="808080" w:themeColor="background1" w:themeShade="80"/>
-        </w:rPr>
-      </w:pPr>
-      <w:r>
-        <w:rPr>
-          <w:rFonts w:ascii="Arial" w:hAnsi="Arial" w:cs="Arial"/>
-          <w:color w:val="808080" w:themeColor="background1" w:themeShade="80"/>
+          <w:sz w:val="24"/>
+          <w:szCs w:val="24"/>
+        </w:rPr>
+      </w:pPr>
+      <w:r>
+        <w:rPr>
+          <w:rFonts w:ascii="Arial" w:hAnsi="Arial" w:cs="Arial"/>
+          <w:color w:val="808080" w:themeColor="background1" w:themeShade="80"/>
+          <w:sz w:val="24"/>
+          <w:szCs w:val="24"/>
         </w:rPr>
         <w:t>Veure si hi ha trips repetits exactament iguals (les mateixes parades i mateixos temps)</w:t>
       </w:r>
@@ -77,14 +158,78 @@
         <w:rPr>
           <w:rFonts w:ascii="Arial" w:hAnsi="Arial" w:cs="Arial"/>
           <w:color w:val="808080" w:themeColor="background1" w:themeShade="80"/>
-        </w:rPr>
-      </w:pPr>
-      <w:r>
-        <w:rPr>
-          <w:rFonts w:ascii="Arial" w:hAnsi="Arial" w:cs="Arial"/>
-          <w:color w:val="808080" w:themeColor="background1" w:themeShade="80"/>
-        </w:rPr>
-        <w:t>Fer dict[route_id]=set[trip_id]</w:t>
+          <w:sz w:val="24"/>
+          <w:szCs w:val="24"/>
+        </w:rPr>
+      </w:pPr>
+      <w:r>
+        <w:rPr>
+          <w:rFonts w:ascii="Arial" w:hAnsi="Arial" w:cs="Arial"/>
+          <w:color w:val="808080" w:themeColor="background1" w:themeShade="80"/>
+          <w:sz w:val="24"/>
+          <w:szCs w:val="24"/>
+        </w:rPr>
+        <w:t xml:space="preserve">Fer </w:t>
+      </w:r>
+      <w:proofErr w:type="spellStart"/>
+      <w:r>
+        <w:rPr>
+          <w:rFonts w:ascii="Arial" w:hAnsi="Arial" w:cs="Arial"/>
+          <w:color w:val="808080" w:themeColor="background1" w:themeShade="80"/>
+          <w:sz w:val="24"/>
+          <w:szCs w:val="24"/>
+        </w:rPr>
+        <w:t>dict</w:t>
+      </w:r>
+      <w:proofErr w:type="spellEnd"/>
+      <w:r>
+        <w:rPr>
+          <w:rFonts w:ascii="Arial" w:hAnsi="Arial" w:cs="Arial"/>
+          <w:color w:val="808080" w:themeColor="background1" w:themeShade="80"/>
+          <w:sz w:val="24"/>
+          <w:szCs w:val="24"/>
+        </w:rPr>
+        <w:t>[</w:t>
+      </w:r>
+      <w:proofErr w:type="spellStart"/>
+      <w:r>
+        <w:rPr>
+          <w:rFonts w:ascii="Arial" w:hAnsi="Arial" w:cs="Arial"/>
+          <w:color w:val="808080" w:themeColor="background1" w:themeShade="80"/>
+          <w:sz w:val="24"/>
+          <w:szCs w:val="24"/>
+        </w:rPr>
+        <w:t>route_id</w:t>
+      </w:r>
+      <w:proofErr w:type="spellEnd"/>
+      <w:r>
+        <w:rPr>
+          <w:rFonts w:ascii="Arial" w:hAnsi="Arial" w:cs="Arial"/>
+          <w:color w:val="808080" w:themeColor="background1" w:themeShade="80"/>
+          <w:sz w:val="24"/>
+          <w:szCs w:val="24"/>
+        </w:rPr>
+        <w:t>]=set[</w:t>
+      </w:r>
+      <w:proofErr w:type="spellStart"/>
+      <w:r>
+        <w:rPr>
+          <w:rFonts w:ascii="Arial" w:hAnsi="Arial" w:cs="Arial"/>
+          <w:color w:val="808080" w:themeColor="background1" w:themeShade="80"/>
+          <w:sz w:val="24"/>
+          <w:szCs w:val="24"/>
+        </w:rPr>
+        <w:t>trip_id</w:t>
+      </w:r>
+      <w:proofErr w:type="spellEnd"/>
+      <w:r>
+        <w:rPr>
+          <w:rFonts w:ascii="Arial" w:hAnsi="Arial" w:cs="Arial"/>
+          <w:color w:val="808080" w:themeColor="background1" w:themeShade="80"/>
+          <w:sz w:val="24"/>
+          <w:szCs w:val="24"/>
+        </w:rPr>
+        <w:t>]</w:t>
       </w:r>
     </w:p>
     <w:p>
@@ -96,29 +241,84 @@
         </w:numPr>
         <w:rPr>
           <w:rFonts w:ascii="Arial" w:hAnsi="Arial" w:cs="Arial"/>
-        </w:rPr>
-      </w:pPr>
-      <w:r>
-        <w:rPr>
-          <w:rFonts w:ascii="Arial" w:hAnsi="Arial" w:cs="Arial"/>
-        </w:rPr>
-        <w:t>Màxim and mínim stop_sequence són els límits de les línies?</w:t>
-      </w:r>
-      <w:r>
-        <w:rPr>
-          <w:rFonts w:ascii="Arial" w:hAnsi="Arial" w:cs="Arial"/>
+          <w:color w:val="808080" w:themeColor="background1" w:themeShade="80"/>
+          <w:sz w:val="24"/>
+          <w:szCs w:val="24"/>
+        </w:rPr>
+      </w:pPr>
+      <w:r>
+        <w:rPr>
+          <w:rFonts w:ascii="Arial" w:hAnsi="Arial" w:cs="Arial"/>
+          <w:color w:val="808080" w:themeColor="background1" w:themeShade="80"/>
+          <w:sz w:val="24"/>
+          <w:szCs w:val="24"/>
+        </w:rPr>
+        <w:t xml:space="preserve">Màxim </w:t>
+      </w:r>
+      <w:proofErr w:type="spellStart"/>
+      <w:r>
+        <w:rPr>
+          <w:rFonts w:ascii="Arial" w:hAnsi="Arial" w:cs="Arial"/>
+          <w:color w:val="808080" w:themeColor="background1" w:themeShade="80"/>
+          <w:sz w:val="24"/>
+          <w:szCs w:val="24"/>
+        </w:rPr>
+        <w:t>and</w:t>
+      </w:r>
+      <w:proofErr w:type="spellEnd"/>
+      <w:r>
+        <w:rPr>
+          <w:rFonts w:ascii="Arial" w:hAnsi="Arial" w:cs="Arial"/>
+          <w:color w:val="808080" w:themeColor="background1" w:themeShade="80"/>
+          <w:sz w:val="24"/>
+          <w:szCs w:val="24"/>
+        </w:rPr>
+        <w:t xml:space="preserve"> mínim </w:t>
+      </w:r>
+      <w:proofErr w:type="spellStart"/>
+      <w:r>
+        <w:rPr>
+          <w:rFonts w:ascii="Arial" w:hAnsi="Arial" w:cs="Arial"/>
+          <w:color w:val="808080" w:themeColor="background1" w:themeShade="80"/>
+          <w:sz w:val="24"/>
+          <w:szCs w:val="24"/>
+        </w:rPr>
+        <w:t>stop_sequence</w:t>
+      </w:r>
+      <w:proofErr w:type="spellEnd"/>
+      <w:r>
+        <w:rPr>
+          <w:rFonts w:ascii="Arial" w:hAnsi="Arial" w:cs="Arial"/>
+          <w:color w:val="808080" w:themeColor="background1" w:themeShade="80"/>
+          <w:sz w:val="24"/>
+          <w:szCs w:val="24"/>
+        </w:rPr>
+        <w:t xml:space="preserve"> són els límits de les línies?</w:t>
+      </w:r>
+      <w:r>
+        <w:rPr>
+          <w:rFonts w:ascii="Arial" w:hAnsi="Arial" w:cs="Arial"/>
+          <w:color w:val="808080" w:themeColor="background1" w:themeShade="80"/>
+          <w:sz w:val="24"/>
+          <w:szCs w:val="24"/>
         </w:rPr>
         <w:t xml:space="preserve"> </w:t>
       </w:r>
       <w:r>
         <w:rPr>
           <w:rFonts w:ascii="Arial" w:hAnsi="Arial" w:cs="Arial"/>
+          <w:color w:val="808080" w:themeColor="background1" w:themeShade="80"/>
+          <w:sz w:val="24"/>
+          <w:szCs w:val="24"/>
         </w:rPr>
         <w:sym w:font="Wingdings" w:char="F0DF"/>
       </w:r>
       <w:r>
         <w:rPr>
           <w:rFonts w:ascii="Arial" w:hAnsi="Arial" w:cs="Arial"/>
+          <w:color w:val="808080" w:themeColor="background1" w:themeShade="80"/>
+          <w:sz w:val="24"/>
+          <w:szCs w:val="24"/>
         </w:rPr>
         <w:t xml:space="preserve"> ACABAR DE FER BÉ LES CEL·LES</w:t>
       </w:r>
@@ -132,11 +332,15 @@
         </w:numPr>
         <w:rPr>
           <w:rFonts w:ascii="Arial" w:hAnsi="Arial" w:cs="Arial"/>
-        </w:rPr>
-      </w:pPr>
-      <w:r>
-        <w:rPr>
-          <w:rFonts w:ascii="Arial" w:hAnsi="Arial" w:cs="Arial"/>
+          <w:sz w:val="24"/>
+          <w:szCs w:val="24"/>
+        </w:rPr>
+      </w:pPr>
+      <w:r>
+        <w:rPr>
+          <w:rFonts w:ascii="Arial" w:hAnsi="Arial" w:cs="Arial"/>
+          <w:sz w:val="24"/>
+          <w:szCs w:val="24"/>
         </w:rPr>
         <w:t xml:space="preserve">Trips: </w:t>
       </w:r>
@@ -146,13 +350,27 @@
         <w:pStyle w:val="Prrafodelista"/>
         <w:rPr>
           <w:rFonts w:ascii="Arial" w:hAnsi="Arial" w:cs="Arial"/>
-        </w:rPr>
-      </w:pPr>
-      <w:r>
-        <w:rPr>
-          <w:rFonts w:ascii="Arial" w:hAnsi="Arial" w:cs="Arial"/>
-        </w:rPr>
-        <w:t>Trip_headsign de trips funciona correctament?</w:t>
+          <w:sz w:val="24"/>
+          <w:szCs w:val="24"/>
+        </w:rPr>
+      </w:pPr>
+      <w:proofErr w:type="spellStart"/>
+      <w:r>
+        <w:rPr>
+          <w:rFonts w:ascii="Arial" w:hAnsi="Arial" w:cs="Arial"/>
+          <w:sz w:val="24"/>
+          <w:szCs w:val="24"/>
+        </w:rPr>
+        <w:t>Trip_headsign</w:t>
+      </w:r>
+      <w:proofErr w:type="spellEnd"/>
+      <w:r>
+        <w:rPr>
+          <w:rFonts w:ascii="Arial" w:hAnsi="Arial" w:cs="Arial"/>
+          <w:sz w:val="24"/>
+          <w:szCs w:val="24"/>
+        </w:rPr>
+        <w:t xml:space="preserve"> de trips funciona correctament?</w:t>
       </w:r>
     </w:p>
     <w:p>
@@ -165,12 +383,16 @@
         <w:rPr>
           <w:rFonts w:ascii="Arial" w:hAnsi="Arial" w:cs="Arial"/>
           <w:color w:val="808080" w:themeColor="background1" w:themeShade="80"/>
-        </w:rPr>
-      </w:pPr>
-      <w:r>
-        <w:rPr>
-          <w:rFonts w:ascii="Arial" w:hAnsi="Arial" w:cs="Arial"/>
-          <w:color w:val="808080" w:themeColor="background1" w:themeShade="80"/>
+          <w:sz w:val="24"/>
+          <w:szCs w:val="24"/>
+        </w:rPr>
+      </w:pPr>
+      <w:r>
+        <w:rPr>
+          <w:rFonts w:ascii="Arial" w:hAnsi="Arial" w:cs="Arial"/>
+          <w:color w:val="808080" w:themeColor="background1" w:themeShade="80"/>
+          <w:sz w:val="24"/>
+          <w:szCs w:val="24"/>
         </w:rPr>
         <w:t>Veure si hi ha dos grups clars dins d’una mateixa línia (0 i 1)</w:t>
       </w:r>
@@ -184,13 +406,46 @@
         </w:numPr>
         <w:rPr>
           <w:rFonts w:ascii="Arial" w:hAnsi="Arial" w:cs="Arial"/>
-        </w:rPr>
-      </w:pPr>
-      <w:r>
-        <w:rPr>
-          <w:rFonts w:ascii="Arial" w:hAnsi="Arial" w:cs="Arial"/>
+          <w:color w:val="808080" w:themeColor="background1" w:themeShade="80"/>
+          <w:sz w:val="24"/>
+          <w:szCs w:val="24"/>
+        </w:rPr>
+      </w:pPr>
+      <w:r>
+        <w:rPr>
+          <w:rFonts w:ascii="Arial" w:hAnsi="Arial" w:cs="Arial"/>
+          <w:color w:val="808080" w:themeColor="background1" w:themeShade="80"/>
+          <w:sz w:val="24"/>
+          <w:szCs w:val="24"/>
         </w:rPr>
         <w:t>Veure que funcionin bé (la seqüència de parades és com s’indica)</w:t>
+      </w:r>
+      <w:r>
+        <w:rPr>
+          <w:rFonts w:ascii="Arial" w:hAnsi="Arial" w:cs="Arial"/>
+          <w:color w:val="808080" w:themeColor="background1" w:themeShade="80"/>
+          <w:sz w:val="24"/>
+          <w:szCs w:val="24"/>
+        </w:rPr>
+        <w:t xml:space="preserve"> </w:t>
+      </w:r>
+      <w:r>
+        <w:rPr>
+          <w:rFonts w:ascii="Arial" w:hAnsi="Arial" w:cs="Arial"/>
+          <w:color w:val="808080" w:themeColor="background1" w:themeShade="80"/>
+          <w:sz w:val="24"/>
+          <w:szCs w:val="24"/>
+        </w:rPr>
+        <w:sym w:font="Wingdings" w:char="F0DF"/>
+      </w:r>
+      <w:r>
+        <w:rPr>
+          <w:rFonts w:ascii="Arial" w:hAnsi="Arial" w:cs="Arial"/>
+          <w:color w:val="808080" w:themeColor="background1" w:themeShade="80"/>
+          <w:sz w:val="24"/>
+          <w:szCs w:val="24"/>
+        </w:rPr>
+        <w:t xml:space="preserve"> NO CREC QUE SIGUI NECESSARI</w:t>
       </w:r>
     </w:p>
     <w:p>
@@ -202,14 +457,20 @@
         </w:numPr>
         <w:rPr>
           <w:rFonts w:ascii="Arial" w:hAnsi="Arial" w:cs="Arial"/>
-        </w:rPr>
-      </w:pPr>
-      <w:r>
-        <w:rPr>
-          <w:rFonts w:ascii="Arial" w:hAnsi="Arial" w:cs="Arial"/>
+          <w:sz w:val="24"/>
+          <w:szCs w:val="24"/>
+        </w:rPr>
+      </w:pPr>
+      <w:proofErr w:type="spellStart"/>
+      <w:r>
+        <w:rPr>
+          <w:rFonts w:ascii="Arial" w:hAnsi="Arial" w:cs="Arial"/>
+          <w:sz w:val="24"/>
+          <w:szCs w:val="24"/>
         </w:rPr>
         <w:t>Pathways</w:t>
       </w:r>
+      <w:proofErr w:type="spellEnd"/>
     </w:p>
     <w:p>
       <w:pPr>
@@ -221,14 +482,29 @@
         <w:rPr>
           <w:rFonts w:ascii="Arial" w:hAnsi="Arial" w:cs="Arial"/>
           <w:color w:val="808080" w:themeColor="background1" w:themeShade="80"/>
-        </w:rPr>
-      </w:pPr>
-      <w:r>
-        <w:rPr>
-          <w:rFonts w:ascii="Arial" w:hAnsi="Arial" w:cs="Arial"/>
-          <w:color w:val="808080" w:themeColor="background1" w:themeShade="80"/>
-        </w:rPr>
-        <w:t>Traversal_time mateix pels dos casos?</w:t>
+          <w:sz w:val="24"/>
+          <w:szCs w:val="24"/>
+        </w:rPr>
+      </w:pPr>
+      <w:proofErr w:type="spellStart"/>
+      <w:r>
+        <w:rPr>
+          <w:rFonts w:ascii="Arial" w:hAnsi="Arial" w:cs="Arial"/>
+          <w:color w:val="808080" w:themeColor="background1" w:themeShade="80"/>
+          <w:sz w:val="24"/>
+          <w:szCs w:val="24"/>
+        </w:rPr>
+        <w:t>Traversal_time</w:t>
+      </w:r>
+      <w:proofErr w:type="spellEnd"/>
+      <w:r>
+        <w:rPr>
+          <w:rFonts w:ascii="Arial" w:hAnsi="Arial" w:cs="Arial"/>
+          <w:color w:val="808080" w:themeColor="background1" w:themeShade="80"/>
+          <w:sz w:val="24"/>
+          <w:szCs w:val="24"/>
+        </w:rPr>
+        <w:t xml:space="preserve"> mateix pels dos casos?</w:t>
       </w:r>
     </w:p>
     <w:p>
@@ -241,14 +517,29 @@
         <w:rPr>
           <w:rFonts w:ascii="Arial" w:hAnsi="Arial" w:cs="Arial"/>
           <w:color w:val="808080" w:themeColor="background1" w:themeShade="80"/>
-        </w:rPr>
-      </w:pPr>
-      <w:r>
-        <w:rPr>
-          <w:rFonts w:ascii="Arial" w:hAnsi="Arial" w:cs="Arial"/>
-          <w:color w:val="808080" w:themeColor="background1" w:themeShade="80"/>
-        </w:rPr>
-        <w:t>Traversal_time de 15 en 15?</w:t>
+          <w:sz w:val="24"/>
+          <w:szCs w:val="24"/>
+        </w:rPr>
+      </w:pPr>
+      <w:proofErr w:type="spellStart"/>
+      <w:r>
+        <w:rPr>
+          <w:rFonts w:ascii="Arial" w:hAnsi="Arial" w:cs="Arial"/>
+          <w:color w:val="808080" w:themeColor="background1" w:themeShade="80"/>
+          <w:sz w:val="24"/>
+          <w:szCs w:val="24"/>
+        </w:rPr>
+        <w:t>Traversal_time</w:t>
+      </w:r>
+      <w:proofErr w:type="spellEnd"/>
+      <w:r>
+        <w:rPr>
+          <w:rFonts w:ascii="Arial" w:hAnsi="Arial" w:cs="Arial"/>
+          <w:color w:val="808080" w:themeColor="background1" w:themeShade="80"/>
+          <w:sz w:val="24"/>
+          <w:szCs w:val="24"/>
+        </w:rPr>
+        <w:t xml:space="preserve"> de 15 en 15?</w:t>
       </w:r>
     </w:p>
     <w:p>

</xml_diff>